<commit_message>
dose priority sampling in vacc_impact.qmd
</commit_message>
<xml_diff>
--- a/papers/Figures_1Oct2025.docx
+++ b/papers/Figures_1Oct2025.docx
@@ -1208,10 +1208,10 @@
         </w:rPr>
         <w:lastRenderedPageBreak/>
         <w:drawing>
-          <wp:inline distT="0" distB="0" distL="0" distR="0" wp14:anchorId="1AB4FA97" wp14:editId="6F9C1CB8">
+          <wp:inline distT="0" distB="0" distL="0" distR="0" wp14:anchorId="7555C880" wp14:editId="115ADE01">
             <wp:extent cx="6000750" cy="8094980"/>
             <wp:effectExtent l="0" t="0" r="0" b="1270"/>
-            <wp:docPr id="41338233" name="Picture 1" descr="A screenshot of a graph&#10;&#10;AI-generated content may be incorrect."/>
+            <wp:docPr id="106305411" name="Picture 1"/>
             <wp:cNvGraphicFramePr>
               <a:graphicFrameLocks xmlns:a="http://schemas.openxmlformats.org/drawingml/2006/main" noChangeAspect="1"/>
             </wp:cNvGraphicFramePr>
@@ -1219,7 +1219,7 @@
               <a:graphicData uri="http://schemas.openxmlformats.org/drawingml/2006/picture">
                 <pic:pic xmlns:pic="http://schemas.openxmlformats.org/drawingml/2006/picture">
                   <pic:nvPicPr>
-                    <pic:cNvPr id="41338233" name="Picture 1" descr="A screenshot of a graph&#10;&#10;AI-generated content may be incorrect."/>
+                    <pic:cNvPr id="106305411" name=""/>
                     <pic:cNvPicPr/>
                   </pic:nvPicPr>
                   <pic:blipFill>
@@ -1252,15 +1252,6 @@
           <w:szCs w:val="24"/>
         </w:rPr>
       </w:pPr>
-    </w:p>
-    <w:p>
-      <w:pPr>
-        <w:rPr>
-          <w:rFonts w:ascii="Aptos" w:hAnsi="Aptos" w:cs="Cambria Math"/>
-          <w:sz w:val="24"/>
-          <w:szCs w:val="24"/>
-        </w:rPr>
-      </w:pPr>
       <w:bookmarkStart w:id="1" w:name="_Hlk201150202"/>
       <w:r>
         <w:rPr>
@@ -1270,6 +1261,7 @@
           <w:sz w:val="24"/>
           <w:szCs w:val="24"/>
         </w:rPr>
+        <w:lastRenderedPageBreak/>
         <w:t>Fig</w:t>
       </w:r>
       <w:r>

</xml_diff>

<commit_message>
figure 3 finalized -- ca, capd, and dapd
</commit_message>
<xml_diff>
--- a/papers/Figures_1Oct2025.docx
+++ b/papers/Figures_1Oct2025.docx
@@ -1254,10 +1254,10 @@
         </w:rPr>
         <w:lastRenderedPageBreak/>
         <w:drawing>
-          <wp:inline distT="0" distB="0" distL="0" distR="0" wp14:anchorId="7555C880" wp14:editId="34BF8F5B">
-            <wp:extent cx="6000750" cy="8094980"/>
-            <wp:effectExtent l="0" t="0" r="0" b="1270"/>
-            <wp:docPr id="106305411" name="Picture 1" descr="A screenshot of a graph&#10;&#10;AI-generated content may be incorrect."/>
+          <wp:inline distT="0" distB="0" distL="0" distR="0" wp14:anchorId="5DFFF391" wp14:editId="3AC78460">
+            <wp:extent cx="6000750" cy="8094345"/>
+            <wp:effectExtent l="0" t="0" r="0" b="1905"/>
+            <wp:docPr id="1142944907" name="Picture 1" descr="A collage of graphs and diagrams&#10;&#10;AI-generated content may be incorrect."/>
             <wp:cNvGraphicFramePr>
               <a:graphicFrameLocks xmlns:a="http://schemas.openxmlformats.org/drawingml/2006/main" noChangeAspect="1"/>
             </wp:cNvGraphicFramePr>
@@ -1265,7 +1265,7 @@
               <a:graphicData uri="http://schemas.openxmlformats.org/drawingml/2006/picture">
                 <pic:pic xmlns:pic="http://schemas.openxmlformats.org/drawingml/2006/picture">
                   <pic:nvPicPr>
-                    <pic:cNvPr id="106305411" name="Picture 1" descr="A screenshot of a graph&#10;&#10;AI-generated content may be incorrect."/>
+                    <pic:cNvPr id="1142944907" name="Picture 1" descr="A collage of graphs and diagrams&#10;&#10;AI-generated content may be incorrect."/>
                     <pic:cNvPicPr/>
                   </pic:nvPicPr>
                   <pic:blipFill>
@@ -1277,7 +1277,7 @@
                   <pic:spPr>
                     <a:xfrm>
                       <a:off x="0" y="0"/>
-                      <a:ext cx="6000750" cy="8094980"/>
+                      <a:ext cx="6000750" cy="8094345"/>
                     </a:xfrm>
                     <a:prstGeom prst="rect">
                       <a:avLst/>

</xml_diff>